<commit_message>
Aclara que las pruebas del taller se corrieron en equipo externo
Agrega al documento de evidencia la aclaracion de que las pruebas se
ejecutaron en un computador externo, dentro del taller, para validar
el funcionamiento en el entorno real de uso.
</commit_message>
<xml_diff>
--- a/documentacion_monografia/Pruebas_Funcionamiento_Taller.docx
+++ b/documentacion_monografia/Pruebas_Funcionamiento_Taller.docx
@@ -21,7 +21,13 @@
         <w:rPr>
           <w:i/>
         </w:rPr>
-        <w:t>generó estos escenarios está en el repositorio: utils/poblar_escenarios_prueba.py.</w:t>
+        <w:t>generó estos escenarios está en el repositorio: utils/poblar_escenarios_prueba.py. Las pruebas se ejecutaron en un computador externo, dentro de las instalaciones del taller, para comprobar el funcionamiento de la aplicación en un equipo distinto al de des</w:t>
+      </w:r>
+      <w:r>
+        <w:rPr>
+          <w:i/>
+        </w:rPr>
+        <w:t>arrollo y en el entorno real de uso.</w:t>
       </w:r>
     </w:p>
     <w:p>
@@ -34,13 +40,13 @@
     </w:p>
     <w:p>
       <w:r>
-        <w:t>Se crearon 8 aprendices nuevos y 4 cursos nuevos (además de completar 2 cursos que ya existían pero estaban vacíos), y se matriculó a cada aprendiz en un curs</w:t>
+        <w:t>Se crearon 8 aprendices nuevos y 4 cursos nuevos (además de completar 2 cursos que ya existían pero estaban vacíos), y se matriculó a cada aprendiz en un curso distinto, llevándolo a propósito por un esce</w:t>
       </w:r>
       <w:r>
-        <w:t>o distinto, llevándolo a propósito por un escenario distinto: graduarse, perder la evaluación, que le rechacen un taller, ir avanzando bien, quedar en riesgo por inactividad prolongada, o no hacer nada todavía. Cada acción (matricular, marcar contenido vis</w:t>
+        <w:t>nario distinto: graduarse, perder la evaluación, que le rechacen un taller, ir avanzando bien, quedar en riesgo por inactividad prolongada, o no hacer nada todavía. Cada acción (matricular, marcar contenido visto, presentar una evaluación, entregar y calif</w:t>
       </w:r>
       <w:r>
-        <w:t>to, presentar una evaluación, entregar y calificar un taller) se hizo llamando al controlador real de la aplicación, el mismo código que ejecuta un clic en la interfaz.</w:t>
+        <w:t>icar un taller) se hizo llamando al controlador real de la aplicación, el mismo código que ejecuta un clic en la interfaz.</w:t>
       </w:r>
     </w:p>
     <w:p>
@@ -145,10 +151,7 @@
           </w:tcPr>
           <w:p>
             <w:r>
-              <w:t>Di</w:t>
-            </w:r>
-            <w:r>
-              <w:t>agnóstico de Fugas...</w:t>
+              <w:t>Diagnóstico de Fugas...</w:t>
             </w:r>
           </w:p>
         </w:tc>
@@ -168,7 +171,10 @@
           </w:tcPr>
           <w:p>
             <w:r>
-              <w:t>100% visto, evaluación aprobada → curso COMPLETADO, semáforo VERDE</w:t>
+              <w:t>10</w:t>
+            </w:r>
+            <w:r>
+              <w:t>0% visto, evaluación aprobada → curso COMPLETADO, semáforo VERDE</w:t>
             </w:r>
           </w:p>
         </w:tc>
@@ -258,7 +264,10 @@
           </w:tcPr>
           <w:p>
             <w:r>
-              <w:t>100% del contenido visto, pero 2/2 intentos con nota 0.0 → nunca completa el curso</w:t>
+              <w:t xml:space="preserve">100% del </w:t>
+            </w:r>
+            <w:r>
+              <w:t>contenido visto, pero 2/2 intentos con nota 0.0 → nunca completa el curso</w:t>
             </w:r>
           </w:p>
         </w:tc>
@@ -303,10 +312,11 @@
           </w:tcPr>
           <w:p>
             <w:r>
-              <w:t>Entregó el taller; el instructor lo calificó RECHAZADO con comentario → curso</w:t>
+              <w:t xml:space="preserve">Entregó el taller; el instructor lo calificó RECHAZADO con comentario → curso </w:t>
             </w:r>
             <w:r>
-              <w:t xml:space="preserve"> no se completa</w:t>
+              <w:lastRenderedPageBreak/>
+              <w:t>no se completa</w:t>
             </w:r>
           </w:p>
         </w:tc>
@@ -321,6 +331,7 @@
           </w:tcPr>
           <w:p>
             <w:r>
+              <w:lastRenderedPageBreak/>
               <w:t>Mariana Gómez</w:t>
             </w:r>
           </w:p>
@@ -331,7 +342,10 @@
           </w:tcPr>
           <w:p>
             <w:r>
-              <w:t>Diagnóstico de Fugas...</w:t>
+              <w:t>Diagnóstico</w:t>
+            </w:r>
+            <w:r>
+              <w:t xml:space="preserve"> de Fugas...</w:t>
             </w:r>
           </w:p>
         </w:tc>
@@ -351,11 +365,7 @@
           </w:tcPr>
           <w:p>
             <w:r>
-              <w:t xml:space="preserve">67% de avance, matrícula reciente, </w:t>
-            </w:r>
-            <w:r>
-              <w:lastRenderedPageBreak/>
-              <w:t>semáforo AMARILLO (horas de uso por debajo de lo estimado)</w:t>
+              <w:t>67% de avance, matrícula reciente, semáforo AMARILLO (horas de uso por debajo de lo estimado)</w:t>
             </w:r>
           </w:p>
         </w:tc>
@@ -370,7 +380,6 @@
           </w:tcPr>
           <w:p>
             <w:r>
-              <w:lastRenderedPageBreak/>
               <w:t>Esteban Cárdenas</w:t>
             </w:r>
           </w:p>
@@ -401,10 +410,10 @@
           </w:tcPr>
           <w:p>
             <w:r>
-              <w:t>0% de avance, matriculado hace 40 días →</w:t>
+              <w:t>0% de avance, matriculado hace 40 días → semáforo ROJO, aparece en “Aprendices crí</w:t>
             </w:r>
             <w:r>
-              <w:t xml:space="preserve"> semáforo ROJO, aparece en “Aprendices críticos”</w:t>
+              <w:t>ticos”</w:t>
             </w:r>
           </w:p>
         </w:tc>
@@ -484,10 +493,7 @@
           </w:tcPr>
           <w:p>
             <w:r>
-              <w:t xml:space="preserve">Sin </w:t>
-            </w:r>
-            <w:r>
-              <w:t>actividad y en riesgo</w:t>
+              <w:t>Sin actividad y en riesgo</w:t>
             </w:r>
           </w:p>
         </w:tc>
@@ -497,7 +503,10 @@
           </w:tcPr>
           <w:p>
             <w:r>
-              <w:t>0% de avance, matriculado hace 25 días → semáforo ROJO, aparece en “Aprendices críticos”</w:t>
+              <w:t xml:space="preserve">0% de avance, </w:t>
+            </w:r>
+            <w:r>
+              <w:t>matriculado hace 25 días → semáforo ROJO, aparece en “Aprendices críticos”</w:t>
             </w:r>
           </w:p>
         </w:tc>
@@ -551,13 +560,10 @@
     <w:p/>
     <w:p>
       <w:r>
-        <w:t>Veri</w:t>
+        <w:t>Verificación cruzada: los dos aprendices</w:t>
       </w:r>
       <w:r>
-        <w:t>ficación cruzada: los dos aprendices marcados en riesgo (Esteban Cárdenas y Andrés Felipe Soto) son exactamente los dos que devuelve estudiantes_en_riesgo() para sus respectivos instructores, confirmando que el cálculo automático coincide con lo esperado p</w:t>
-      </w:r>
-      <w:r>
-        <w:t>or diseño del escenario.</w:t>
+        <w:t xml:space="preserve"> marcados en riesgo (Esteban Cárdenas y Andrés Felipe Soto) son exactamente los dos que devuelve estudiantes_en_riesgo() para sus respectivos instructores, confirmando que el cálculo automático coincide con lo esperado por diseño del escenario.</w:t>
       </w:r>
     </w:p>
     <w:p>
@@ -566,7 +572,10 @@
       </w:pPr>
       <w:r>
         <w:lastRenderedPageBreak/>
-        <w:t>3. Evidencia visual</w:t>
+        <w:t>3. Evidenci</w:t>
+      </w:r>
+      <w:r>
+        <w:t>a visual</w:t>
       </w:r>
     </w:p>
     <w:p>
@@ -578,7 +587,7 @@
           <w:noProof/>
         </w:rPr>
         <w:drawing>
-          <wp:inline distT="0" distB="0" distL="0" distR="0" wp14:anchorId="17F9262A" wp14:editId="4C39D1C1">
+          <wp:inline distT="0" distB="0" distL="0" distR="0" wp14:anchorId="0678FFC2" wp14:editId="6AF86CB2">
             <wp:extent cx="5669280" cy="4360985"/>
             <wp:effectExtent l="0" t="0" r="0" b="0"/>
             <wp:docPr id="1" name="Picture 1"/>
@@ -637,7 +646,7 @@
         </w:rPr>
         <w:lastRenderedPageBreak/>
         <w:drawing>
-          <wp:inline distT="0" distB="0" distL="0" distR="0" wp14:anchorId="6130B14D" wp14:editId="240ECF29">
+          <wp:inline distT="0" distB="0" distL="0" distR="0" wp14:anchorId="576EE3D8" wp14:editId="5427C6FC">
             <wp:extent cx="5669280" cy="3924886"/>
             <wp:effectExtent l="0" t="0" r="0" b="0"/>
             <wp:docPr id="2" name="Picture 2"/>
@@ -683,14 +692,14 @@
           <w:b/>
           <w:sz w:val="20"/>
         </w:rPr>
-        <w:t xml:space="preserve">Figura 2. Reportes del instructor Fernando Quintero: 1 aprendiz </w:t>
+        <w:t xml:space="preserve">Figura 2. Reportes del instructor Fernando Quintero: 1 aprendiz crítico (Andrés Felipe Soto), 8 cursos </w:t>
       </w:r>
       <w:r>
         <w:rPr>
           <w:b/>
           <w:sz w:val="20"/>
         </w:rPr>
-        <w:t>crítico (Andrés Felipe Soto), 8 cursos activos y 60% de aprobación general</w:t>
+        <w:t>activos y 60% de aprobación general</w:t>
       </w:r>
     </w:p>
     <w:p>
@@ -703,7 +712,7 @@
         </w:rPr>
         <w:lastRenderedPageBreak/>
         <w:drawing>
-          <wp:inline distT="0" distB="0" distL="0" distR="0" wp14:anchorId="672E18DB" wp14:editId="6E7C75E7">
+          <wp:inline distT="0" distB="0" distL="0" distR="0" wp14:anchorId="15099282" wp14:editId="2B463A5A">
             <wp:extent cx="5669280" cy="5002306"/>
             <wp:effectExtent l="0" t="0" r="0" b="0"/>
             <wp:docPr id="3" name="Picture 3"/>
@@ -762,16 +771,16 @@
     </w:p>
     <w:p>
       <w:r>
-        <w:t xml:space="preserve">Las </w:t>
+        <w:t xml:space="preserve">Las reglas de negocio del sistema (cuándo un </w:t>
       </w:r>
       <w:r>
-        <w:t>reglas de negocio del sistema (cuándo un curso se marca completado, cuándo un aprendiz entra en el semáforo de riesgo, cuántos intentos quedan en una evaluación) se comportaron como estaba diseñado frente a datos variados y reales, no solo frente a los cas</w:t>
+        <w:t>curso se marca completado, cuándo un aprendiz entra en el semáforo de riesgo, cuántos intentos quedan en una evaluación) se comportaron como estaba diseñado frente a datos variados y reales, no solo frente a los casos simples usados en las pruebas automati</w:t>
       </w:r>
       <w:r>
-        <w:t>os simples usados en las pruebas automatizadas. Durante la construcción de este escenario se encontró y corrigió un detalle real: con un avance de 33% a los 40 días, un aprendiz quedaba apenas por encima del umbral de riesgo (30%) y no se marcaba como crít</w:t>
+        <w:t>zadas. Durante la construcción de este escenario se encontró y corrigió un detalle real: con un avance de 33% a los 40 días, un aprendiz quedaba apenas por encima del umbral de riesgo (30%) y no se marcaba como crítico; se ajustó el escenario para dejar ev</w:t>
       </w:r>
       <w:r>
-        <w:t>ico; se ajustó el escenario para dejar evidencia de ambos lados de ese umbral.</w:t>
+        <w:t>idencia de ambos lados de ese umbral.</w:t>
       </w:r>
     </w:p>
     <w:sectPr>

</xml_diff>